<commit_message>
Improved handling of disability labeling
</commit_message>
<xml_diff>
--- a/biochar_app/markdown/docx/help_main.docx
+++ b/biochar_app/markdown/docx/help_main.docx
@@ -3,128 +3,165 @@
 <w:document xmlns:wpc="http://schemas.microsoft.com/office/word/2010/wordprocessingCanvas" xmlns:cx="http://schemas.microsoft.com/office/drawing/2014/chartex" xmlns:cx1="http://schemas.microsoft.com/office/drawing/2015/9/8/chartex" xmlns:cx2="http://schemas.microsoft.com/office/drawing/2015/10/21/chartex" xmlns:cx3="http://schemas.microsoft.com/office/drawing/2016/5/9/chartex" xmlns:cx4="http://schemas.microsoft.com/office/drawing/2016/5/10/chartex" xmlns:cx5="http://schemas.microsoft.com/office/drawing/2016/5/11/chartex" xmlns:cx6="http://schemas.microsoft.com/office/drawing/2016/5/12/chartex" xmlns:cx7="http://schemas.microsoft.com/office/drawing/2016/5/13/chartex" xmlns:cx8="http://schemas.microsoft.com/office/drawing/2016/5/14/chartex" xmlns:mc="http://schemas.openxmlformats.org/markup-compatibility/2006" xmlns:aink="http://schemas.microsoft.com/office/drawing/2016/ink" xmlns:am3d="http://schemas.microsoft.com/office/drawing/2017/model3d" xmlns:o="urn:schemas-microsoft-com:office:office" xmlns:oel="http://schemas.microsoft.com/office/2019/extlst" xmlns:r="http://schemas.openxmlformats.org/officeDocument/2006/relationships" xmlns:m="http://schemas.openxmlformats.org/officeDocument/2006/math" xmlns:v="urn:schemas-microsoft-com:vml" xmlns:wp14="http://schemas.microsoft.com/office/word/2010/wordprocessingDrawing" xmlns:wp="http://schemas.openxmlformats.org/drawingml/2006/wordprocessingDrawing" xmlns:w10="urn:schemas-microsoft-com:office:word" xmlns:w="http://schemas.openxmlformats.org/wordprocessingml/2006/main" xmlns:w14="http://schemas.microsoft.com/office/word/2010/wordml" xmlns:w15="http://schemas.microsoft.com/office/word/2012/wordml" xmlns:w16cex="http://schemas.microsoft.com/office/word/2018/wordml/cex" xmlns:w16cid="http://schemas.microsoft.com/office/word/2016/wordml/cid" xmlns:w16="http://schemas.microsoft.com/office/word/2018/wordml" xmlns:w16du="http://schemas.microsoft.com/office/word/2023/wordml/word16du" xmlns:w16sdtdh="http://schemas.microsoft.com/office/word/2020/wordml/sdtdatahash" xmlns:w16sdtfl="http://schemas.microsoft.com/office/word/2024/wordml/sdtformatlock" xmlns:w16se="http://schemas.microsoft.com/office/word/2015/wordml/symex" xmlns:wpg="http://schemas.microsoft.com/office/word/2010/wordprocessingGroup" xmlns:wpi="http://schemas.microsoft.com/office/word/2010/wordprocessingInk" xmlns:wne="http://schemas.microsoft.com/office/word/2006/wordml" xmlns:wps="http://schemas.microsoft.com/office/word/2010/wordprocessingShape" mc:Ignorable="w14 w15 w16se w16cid w16 w16cex w16sdtdh w16sdtfl w16du wp14">
   <w:body>
     <w:p>
+      <w:pPr>
+        <w:pStyle w:val="Heading2"/>
+        <w:rPr>
+          <w:rFonts w:ascii="Georgia" w:hAnsi="Georgia"/>
+        </w:rPr>
+      </w:pPr>
       <w:r>
+        <w:rPr>
+          <w:rFonts w:ascii="Georgia" w:hAnsi="Georgia"/>
+        </w:rPr>
         <w:t>Directions for use of the options in the Main Data Display</w:t>
       </w:r>
     </w:p>
     <w:p>
+      <w:pPr>
+        <w:rPr>
+          <w:rFonts w:ascii="Georgia" w:hAnsi="Georgia"/>
+        </w:rPr>
+      </w:pPr>
       <w:r>
-        <w:t xml:space="preserve">The control panel (left side) has choices for </w:t>
+        <w:rPr>
+          <w:rFonts w:ascii="Georgia" w:hAnsi="Georgia"/>
+        </w:rPr>
+        <w:t xml:space="preserve">The control panel (left side) has </w:t>
+      </w:r>
+      <w:r>
+        <w:rPr>
+          <w:rFonts w:ascii="Georgia" w:hAnsi="Georgia"/>
+        </w:rPr>
+        <w:t xml:space="preserve">the following </w:t>
+      </w:r>
+      <w:r>
+        <w:rPr>
+          <w:rFonts w:ascii="Georgia" w:hAnsi="Georgia"/>
+        </w:rPr>
+        <w:t xml:space="preserve">choices </w:t>
       </w:r>
     </w:p>
     <w:p>
       <w:pPr>
+        <w:pStyle w:val="ListParagraph"/>
         <w:numPr>
           <w:ilvl w:val="0"/>
-          <w:numId w:val="1"/>
+          <w:numId w:val="2"/>
         </w:numPr>
-        <w:spacing w:before="100" w:beforeAutospacing="1" w:after="100" w:afterAutospacing="1" w:line="240" w:lineRule="auto"/>
-        <w:rPr>
-          <w:rFonts w:ascii="Arial" w:eastAsia="Times New Roman" w:hAnsi="Arial" w:cs="Arial"/>
-          <w:color w:val="212529"/>
-          <w:kern w:val="0"/>
-          <w:sz w:val="30"/>
-          <w:szCs w:val="30"/>
-          <w14:ligatures w14:val="none"/>
+        <w:rPr>
+          <w:rFonts w:ascii="Georgia" w:hAnsi="Georgia"/>
         </w:rPr>
       </w:pPr>
       <w:r>
         <w:rPr>
-          <w:rFonts w:ascii="Arial" w:eastAsia="Times New Roman" w:hAnsi="Arial" w:cs="Arial"/>
-          <w:color w:val="212529"/>
-          <w:kern w:val="0"/>
-          <w:sz w:val="30"/>
-          <w:szCs w:val="30"/>
-          <w14:ligatures w14:val="none"/>
+          <w:rFonts w:ascii="Georgia" w:hAnsi="Georgia"/>
+        </w:rPr>
+        <w:t>Toggle between metric and US units</w:t>
+      </w:r>
+    </w:p>
+    <w:p>
+      <w:pPr>
+        <w:pStyle w:val="ListParagraph"/>
+        <w:numPr>
+          <w:ilvl w:val="0"/>
+          <w:numId w:val="2"/>
+        </w:numPr>
+        <w:rPr>
+          <w:rFonts w:ascii="Georgia" w:hAnsi="Georgia"/>
+        </w:rPr>
+      </w:pPr>
+      <w:r>
+        <w:rPr>
+          <w:rFonts w:ascii="Georgia" w:hAnsi="Georgia"/>
         </w:rPr>
         <w:t>Use the dropdowns to filter year, variable, strip, logger location, and depth.</w:t>
       </w:r>
     </w:p>
     <w:p>
       <w:pPr>
+        <w:pStyle w:val="ListParagraph"/>
         <w:numPr>
           <w:ilvl w:val="0"/>
-          <w:numId w:val="1"/>
+          <w:numId w:val="2"/>
         </w:numPr>
-        <w:spacing w:before="100" w:beforeAutospacing="1" w:after="100" w:afterAutospacing="1" w:line="240" w:lineRule="auto"/>
-        <w:rPr>
-          <w:rFonts w:ascii="Arial" w:eastAsia="Times New Roman" w:hAnsi="Arial" w:cs="Arial"/>
-          <w:color w:val="212529"/>
-          <w:kern w:val="0"/>
-          <w:sz w:val="30"/>
-          <w:szCs w:val="30"/>
-          <w14:ligatures w14:val="none"/>
+        <w:rPr>
+          <w:rFonts w:ascii="Georgia" w:hAnsi="Georgia"/>
         </w:rPr>
       </w:pPr>
       <w:r>
         <w:rPr>
-          <w:rFonts w:ascii="Arial" w:eastAsia="Times New Roman" w:hAnsi="Arial" w:cs="Arial"/>
-          <w:color w:val="212529"/>
-          <w:kern w:val="0"/>
-          <w:sz w:val="30"/>
-          <w:szCs w:val="30"/>
-          <w14:ligatures w14:val="none"/>
+          <w:rFonts w:ascii="Georgia" w:hAnsi="Georgia"/>
         </w:rPr>
         <w:t>Click "Update Plots" to refresh the Raw and Ratio plots.</w:t>
       </w:r>
     </w:p>
     <w:p>
       <w:pPr>
+        <w:pStyle w:val="ListParagraph"/>
         <w:numPr>
           <w:ilvl w:val="0"/>
-          <w:numId w:val="1"/>
+          <w:numId w:val="2"/>
         </w:numPr>
-        <w:spacing w:before="100" w:beforeAutospacing="1" w:after="100" w:afterAutospacing="1" w:line="240" w:lineRule="auto"/>
-        <w:rPr>
-          <w:rFonts w:ascii="Arial" w:eastAsia="Times New Roman" w:hAnsi="Arial" w:cs="Arial"/>
-          <w:color w:val="212529"/>
-          <w:kern w:val="0"/>
-          <w:sz w:val="30"/>
-          <w:szCs w:val="30"/>
-          <w14:ligatures w14:val="none"/>
+        <w:rPr>
+          <w:rFonts w:ascii="Georgia" w:hAnsi="Georgia"/>
         </w:rPr>
       </w:pPr>
       <w:r>
         <w:rPr>
-          <w:rFonts w:ascii="Arial" w:eastAsia="Times New Roman" w:hAnsi="Arial" w:cs="Arial"/>
-          <w:color w:val="212529"/>
-          <w:kern w:val="0"/>
-          <w:sz w:val="30"/>
-          <w:szCs w:val="30"/>
-          <w14:ligatures w14:val="none"/>
+          <w:rFonts w:ascii="Georgia" w:hAnsi="Georgia"/>
         </w:rPr>
         <w:t>Zooming or panning on one plot will sync the other.</w:t>
       </w:r>
     </w:p>
     <w:p>
       <w:pPr>
+        <w:pStyle w:val="ListParagraph"/>
         <w:numPr>
           <w:ilvl w:val="0"/>
-          <w:numId w:val="1"/>
+          <w:numId w:val="2"/>
         </w:numPr>
-        <w:spacing w:before="100" w:beforeAutospacing="1" w:after="100" w:afterAutospacing="1" w:line="240" w:lineRule="auto"/>
-        <w:rPr>
-          <w:rFonts w:ascii="Arial" w:eastAsia="Times New Roman" w:hAnsi="Arial" w:cs="Arial"/>
-          <w:color w:val="212529"/>
-          <w:kern w:val="0"/>
-          <w:sz w:val="30"/>
-          <w:szCs w:val="30"/>
-          <w14:ligatures w14:val="none"/>
+        <w:rPr>
+          <w:rFonts w:ascii="Georgia" w:hAnsi="Georgia"/>
         </w:rPr>
       </w:pPr>
       <w:r>
         <w:rPr>
-          <w:rFonts w:ascii="Arial" w:eastAsia="Times New Roman" w:hAnsi="Arial" w:cs="Arial"/>
-          <w:color w:val="212529"/>
-          <w:kern w:val="0"/>
-          <w:sz w:val="30"/>
-          <w:szCs w:val="30"/>
-          <w14:ligatures w14:val="none"/>
-        </w:rPr>
-        <w:t>Use the "Download Data" and "Download Plot" menus to export what you see.</w:t>
+          <w:rFonts w:ascii="Georgia" w:hAnsi="Georgia"/>
+        </w:rPr>
+        <w:t xml:space="preserve">Use the "Download Data" and "Download </w:t>
+      </w:r>
+      <w:r>
+        <w:rPr>
+          <w:rFonts w:ascii="Georgia" w:hAnsi="Georgia"/>
+        </w:rPr>
+        <w:t xml:space="preserve"> Raw and Ratio </w:t>
+      </w:r>
+      <w:r>
+        <w:rPr>
+          <w:rFonts w:ascii="Georgia" w:hAnsi="Georgia"/>
+        </w:rPr>
+        <w:t>Plot</w:t>
+      </w:r>
+      <w:r>
+        <w:rPr>
+          <w:rFonts w:ascii="Georgia" w:hAnsi="Georgia"/>
+        </w:rPr>
+        <w:t>s</w:t>
+      </w:r>
+      <w:r>
+        <w:rPr>
+          <w:rFonts w:ascii="Georgia" w:hAnsi="Georgia"/>
+        </w:rPr>
+        <w:t>" menus to export what you see.</w:t>
       </w:r>
     </w:p>
-    <w:p/>
+    <w:p>
+      <w:pPr>
+        <w:rPr>
+          <w:rFonts w:ascii="Georgia" w:hAnsi="Georgia" w:cs="Times New Roman"/>
+        </w:rPr>
+      </w:pPr>
+    </w:p>
     <w:sectPr>
       <w:pgSz w:w="12240" w:h="15840"/>
       <w:pgMar w:top="1440" w:right="1440" w:bottom="1440" w:left="1440" w:header="720" w:footer="720" w:gutter="0"/>
@@ -286,8 +323,124 @@
       </w:rPr>
     </w:lvl>
   </w:abstractNum>
+  <w:abstractNum w:abstractNumId="1" w15:restartNumberingAfterBreak="0">
+    <w:nsid w:val="5B1B585F"/>
+    <w:multiLevelType w:val="hybridMultilevel"/>
+    <w:tmpl w:val="EEBC60D2"/>
+    <w:lvl w:ilvl="0" w:tplc="04090001">
+      <w:start w:val="1"/>
+      <w:numFmt w:val="bullet"/>
+      <w:lvlText w:val=""/>
+      <w:lvlJc w:val="left"/>
+      <w:pPr>
+        <w:ind w:left="720" w:hanging="360"/>
+      </w:pPr>
+      <w:rPr>
+        <w:rFonts w:ascii="Symbol" w:hAnsi="Symbol" w:hint="default"/>
+      </w:rPr>
+    </w:lvl>
+    <w:lvl w:ilvl="1" w:tplc="04090003" w:tentative="1">
+      <w:start w:val="1"/>
+      <w:numFmt w:val="bullet"/>
+      <w:lvlText w:val="o"/>
+      <w:lvlJc w:val="left"/>
+      <w:pPr>
+        <w:ind w:left="1440" w:hanging="360"/>
+      </w:pPr>
+      <w:rPr>
+        <w:rFonts w:ascii="Courier New" w:hAnsi="Courier New" w:cs="Courier New" w:hint="default"/>
+      </w:rPr>
+    </w:lvl>
+    <w:lvl w:ilvl="2" w:tplc="04090005" w:tentative="1">
+      <w:start w:val="1"/>
+      <w:numFmt w:val="bullet"/>
+      <w:lvlText w:val=""/>
+      <w:lvlJc w:val="left"/>
+      <w:pPr>
+        <w:ind w:left="2160" w:hanging="360"/>
+      </w:pPr>
+      <w:rPr>
+        <w:rFonts w:ascii="Wingdings" w:hAnsi="Wingdings" w:hint="default"/>
+      </w:rPr>
+    </w:lvl>
+    <w:lvl w:ilvl="3" w:tplc="04090001" w:tentative="1">
+      <w:start w:val="1"/>
+      <w:numFmt w:val="bullet"/>
+      <w:lvlText w:val=""/>
+      <w:lvlJc w:val="left"/>
+      <w:pPr>
+        <w:ind w:left="2880" w:hanging="360"/>
+      </w:pPr>
+      <w:rPr>
+        <w:rFonts w:ascii="Symbol" w:hAnsi="Symbol" w:hint="default"/>
+      </w:rPr>
+    </w:lvl>
+    <w:lvl w:ilvl="4" w:tplc="04090003" w:tentative="1">
+      <w:start w:val="1"/>
+      <w:numFmt w:val="bullet"/>
+      <w:lvlText w:val="o"/>
+      <w:lvlJc w:val="left"/>
+      <w:pPr>
+        <w:ind w:left="3600" w:hanging="360"/>
+      </w:pPr>
+      <w:rPr>
+        <w:rFonts w:ascii="Courier New" w:hAnsi="Courier New" w:cs="Courier New" w:hint="default"/>
+      </w:rPr>
+    </w:lvl>
+    <w:lvl w:ilvl="5" w:tplc="04090005" w:tentative="1">
+      <w:start w:val="1"/>
+      <w:numFmt w:val="bullet"/>
+      <w:lvlText w:val=""/>
+      <w:lvlJc w:val="left"/>
+      <w:pPr>
+        <w:ind w:left="4320" w:hanging="360"/>
+      </w:pPr>
+      <w:rPr>
+        <w:rFonts w:ascii="Wingdings" w:hAnsi="Wingdings" w:hint="default"/>
+      </w:rPr>
+    </w:lvl>
+    <w:lvl w:ilvl="6" w:tplc="04090001" w:tentative="1">
+      <w:start w:val="1"/>
+      <w:numFmt w:val="bullet"/>
+      <w:lvlText w:val=""/>
+      <w:lvlJc w:val="left"/>
+      <w:pPr>
+        <w:ind w:left="5040" w:hanging="360"/>
+      </w:pPr>
+      <w:rPr>
+        <w:rFonts w:ascii="Symbol" w:hAnsi="Symbol" w:hint="default"/>
+      </w:rPr>
+    </w:lvl>
+    <w:lvl w:ilvl="7" w:tplc="04090003" w:tentative="1">
+      <w:start w:val="1"/>
+      <w:numFmt w:val="bullet"/>
+      <w:lvlText w:val="o"/>
+      <w:lvlJc w:val="left"/>
+      <w:pPr>
+        <w:ind w:left="5760" w:hanging="360"/>
+      </w:pPr>
+      <w:rPr>
+        <w:rFonts w:ascii="Courier New" w:hAnsi="Courier New" w:cs="Courier New" w:hint="default"/>
+      </w:rPr>
+    </w:lvl>
+    <w:lvl w:ilvl="8" w:tplc="04090005" w:tentative="1">
+      <w:start w:val="1"/>
+      <w:numFmt w:val="bullet"/>
+      <w:lvlText w:val=""/>
+      <w:lvlJc w:val="left"/>
+      <w:pPr>
+        <w:ind w:left="6480" w:hanging="360"/>
+      </w:pPr>
+      <w:rPr>
+        <w:rFonts w:ascii="Wingdings" w:hAnsi="Wingdings" w:hint="default"/>
+      </w:rPr>
+    </w:lvl>
+  </w:abstractNum>
   <w:num w:numId="1" w16cid:durableId="1962765544">
     <w:abstractNumId w:val="0"/>
+  </w:num>
+  <w:num w:numId="2" w16cid:durableId="771097508">
+    <w:abstractNumId w:val="1"/>
   </w:num>
 </w:numbering>
 </file>
@@ -720,7 +873,6 @@
     <w:next w:val="Normal"/>
     <w:link w:val="Heading2Char"/>
     <w:uiPriority w:val="9"/>
-    <w:semiHidden/>
     <w:unhideWhenUsed/>
     <w:qFormat/>
     <w:rsid w:val="00080D51"/>
@@ -937,7 +1089,6 @@
     <w:basedOn w:val="DefaultParagraphFont"/>
     <w:link w:val="Heading2"/>
     <w:uiPriority w:val="9"/>
-    <w:semiHidden/>
     <w:rsid w:val="00080D51"/>
     <w:rPr>
       <w:rFonts w:asciiTheme="majorHAnsi" w:eastAsiaTheme="majorEastAsia" w:hAnsiTheme="majorHAnsi" w:cstheme="majorBidi"/>

</xml_diff>

<commit_message>
Uploading more changes to layouts
</commit_message>
<xml_diff>
--- a/biochar_app/markdown/docx/help_main.docx
+++ b/biochar_app/markdown/docx/help_main.docx
@@ -13,7 +13,13 @@
         <w:rPr>
           <w:rFonts w:ascii="Georgia" w:hAnsi="Georgia"/>
         </w:rPr>
-        <w:t>Directions for use of the options in the Main Data Display</w:t>
+        <w:t xml:space="preserve">Directions for use of the options in the </w:t>
+      </w:r>
+      <w:r>
+        <w:rPr>
+          <w:rFonts w:ascii="Georgia" w:hAnsi="Georgia"/>
+        </w:rPr>
+        <w:t>Interactive Plots tab</w:t>
       </w:r>
     </w:p>
     <w:p>
@@ -74,7 +80,25 @@
         <w:rPr>
           <w:rFonts w:ascii="Georgia" w:hAnsi="Georgia"/>
         </w:rPr>
-        <w:t>Use the dropdowns to filter year, variable, strip, logger location, and depth.</w:t>
+        <w:t xml:space="preserve">Use the dropdowns to </w:t>
+      </w:r>
+      <w:r>
+        <w:rPr>
+          <w:rFonts w:ascii="Georgia" w:hAnsi="Georgia"/>
+        </w:rPr>
+        <w:t>choose</w:t>
+      </w:r>
+      <w:r>
+        <w:rPr>
+          <w:rFonts w:ascii="Georgia" w:hAnsi="Georgia"/>
+        </w:rPr>
+        <w:t xml:space="preserve"> year, variable, strip, logger location, and depth.</w:t>
+      </w:r>
+      <w:r>
+        <w:rPr>
+          <w:rFonts w:ascii="Georgia" w:hAnsi="Georgia"/>
+        </w:rPr>
+        <w:t xml:space="preserve"> </w:t>
       </w:r>
     </w:p>
     <w:p>
@@ -92,7 +116,19 @@
         <w:rPr>
           <w:rFonts w:ascii="Georgia" w:hAnsi="Georgia"/>
         </w:rPr>
-        <w:t>Click "Update Plots" to refresh the Raw and Ratio plots.</w:t>
+        <w:t>Click "Update Plots" to refresh the Raw and Ratio plots</w:t>
+      </w:r>
+      <w:r>
+        <w:rPr>
+          <w:rFonts w:ascii="Georgia" w:hAnsi="Georgia"/>
+        </w:rPr>
+        <w:t xml:space="preserve"> after changing a drop down</w:t>
+      </w:r>
+      <w:r>
+        <w:rPr>
+          <w:rFonts w:ascii="Georgia" w:hAnsi="Georgia"/>
+        </w:rPr>
+        <w:t>.</w:t>
       </w:r>
     </w:p>
     <w:p>
@@ -110,7 +146,7 @@
         <w:rPr>
           <w:rFonts w:ascii="Georgia" w:hAnsi="Georgia"/>
         </w:rPr>
-        <w:t>Zooming or panning on one plot will sync the other.</w:t>
+        <w:t>Drag a rectangle on the top plot to zoom in on a smaller time window. The ratio plot will automatically be synced.</w:t>
       </w:r>
     </w:p>
     <w:p>
@@ -158,9 +194,29 @@
     <w:p>
       <w:pPr>
         <w:rPr>
-          <w:rFonts w:ascii="Georgia" w:hAnsi="Georgia" w:cs="Times New Roman"/>
-        </w:rPr>
-      </w:pPr>
+          <w:rFonts w:ascii="Georgia" w:hAnsi="Georgia"/>
+        </w:rPr>
+      </w:pPr>
+      <w:r>
+        <w:rPr>
+          <w:rFonts w:ascii="Georgia" w:hAnsi="Georgia"/>
+        </w:rPr>
+        <w:t xml:space="preserve">Item-specific help is available in the circle with an </w:t>
+      </w:r>
+      <w:proofErr w:type="spellStart"/>
+      <w:r>
+        <w:rPr>
+          <w:rFonts w:ascii="Georgia" w:hAnsi="Georgia"/>
+        </w:rPr>
+        <w:t>i</w:t>
+      </w:r>
+      <w:proofErr w:type="spellEnd"/>
+      <w:r>
+        <w:rPr>
+          <w:rFonts w:ascii="Georgia" w:hAnsi="Georgia"/>
+        </w:rPr>
+        <w:t xml:space="preserve"> in the middle.</w:t>
+      </w:r>
     </w:p>
     <w:sectPr>
       <w:pgSz w:w="12240" w:h="15840"/>

</xml_diff>